<commit_message>
Re-export the lecture PDF from the .pptx. That one export also brings in the slide fixes from the earlier PR (#11). Re-export the tutorial PDF and the answers PDF from their .docx files.
</commit_message>
<xml_diff>
--- a/content/Lectures/Semester 1/Week 02 - Linear Programming 1/5 Source Files/Week 2 - Linear Programming - Tutorial.docx
+++ b/content/Lectures/Semester 1/Week 02 - Linear Programming 1/5 Source Files/Week 2 - Linear Programming - Tutorial.docx
@@ -381,7 +381,6 @@
         </w:rPr>
         <w:t xml:space="preserve"> and use the </w:t>
       </w:r>
-      <w:proofErr w:type="spellStart"/>
       <w:r>
         <w:rPr>
           <w:rFonts w:ascii="Courier New" w:hAnsi="Courier New" w:cs="Courier New"/>
@@ -390,7 +389,6 @@
         </w:rPr>
         <w:t>linprog</w:t>
       </w:r>
-      <w:proofErr w:type="spellEnd"/>
       <w:r>
         <w:rPr>
           <w:b/>
@@ -584,23 +582,7 @@
           <w:b/>
           <w:bCs/>
         </w:rPr>
-        <w:t xml:space="preserve">How many X’s and </w:t>
-      </w:r>
-      <w:proofErr w:type="gramStart"/>
-      <w:r>
-        <w:rPr>
-          <w:b/>
-          <w:bCs/>
-        </w:rPr>
-        <w:t>Y’s</w:t>
-      </w:r>
-      <w:proofErr w:type="gramEnd"/>
-      <w:r>
-        <w:rPr>
-          <w:b/>
-          <w:bCs/>
-        </w:rPr>
-        <w:t xml:space="preserve"> should be made </w:t>
+        <w:t xml:space="preserve">How many X’s and Y’s should be made </w:t>
       </w:r>
       <w:r>
         <w:rPr>
@@ -709,17 +691,8 @@
           <w:b/>
           <w:bCs/>
         </w:rPr>
-        <w:t xml:space="preserve">20 of product </w:t>
-      </w:r>
-      <w:proofErr w:type="gramStart"/>
-      <w:r>
-        <w:rPr>
-          <w:b/>
-          <w:bCs/>
-        </w:rPr>
-        <w:t>Z</w:t>
-      </w:r>
-      <w:proofErr w:type="gramEnd"/>
+        <w:t>20 of product Z</w:t>
+      </w:r>
     </w:p>
     <w:p>
       <w:pPr>
@@ -783,17 +756,8 @@
           <w:b/>
           <w:bCs/>
         </w:rPr>
-        <w:t xml:space="preserve"> </w:t>
-      </w:r>
-      <w:proofErr w:type="gramStart"/>
-      <w:r>
-        <w:rPr>
-          <w:b/>
-          <w:bCs/>
-        </w:rPr>
-        <w:t>hours</w:t>
-      </w:r>
-      <w:proofErr w:type="gramEnd"/>
+        <w:t xml:space="preserve"> hours</w:t>
+      </w:r>
     </w:p>
     <w:p>
       <w:pPr>
@@ -870,6 +834,7 @@
         <w:pStyle w:val="ListParagraph"/>
       </w:pPr>
       <w:r>
+        <w:lastRenderedPageBreak/>
         <w:t>The quantities of each nutrient contained in one unit of each of 1</w:t>
       </w:r>
       <w:r>
@@ -901,7 +866,6 @@
           <w:b/>
           <w:bCs/>
         </w:rPr>
-        <w:lastRenderedPageBreak/>
         <w:t>You are required to:</w:t>
       </w:r>
     </w:p>
@@ -6209,21 +6173,6 @@
 </file>
 
 <file path=customXml/item2.xml><?xml version="1.0" encoding="utf-8"?>
-<p:properties xmlns:p="http://schemas.microsoft.com/office/2006/metadata/properties" xmlns:xsi="http://www.w3.org/2001/XMLSchema-instance" xmlns:pc="http://schemas.microsoft.com/office/infopath/2007/PartnerControls">
-  <documentManagement/>
-</p:properties>
-</file>
-
-<file path=customXml/item3.xml><?xml version="1.0" encoding="utf-8"?>
-<?mso-contentType ?>
-<FormTemplates xmlns="http://schemas.microsoft.com/sharepoint/v3/contenttype/forms">
-  <Display>DocumentLibraryForm</Display>
-  <Edit>DocumentLibraryForm</Edit>
-  <New>DocumentLibraryForm</New>
-</FormTemplates>
-</file>
-
-<file path=customXml/item4.xml><?xml version="1.0" encoding="utf-8"?>
 <ct:contentTypeSchema xmlns:ct="http://schemas.microsoft.com/office/2006/metadata/contentType" xmlns:ma="http://schemas.microsoft.com/office/2006/metadata/properties/metaAttributes" ct:_="" ma:_="" ma:contentTypeName="Document" ma:contentTypeID="0x01010051A328A96253EC468854895DB51C3CA9" ma:contentTypeVersion="12" ma:contentTypeDescription="Create a new document." ma:contentTypeScope="" ma:versionID="70ca04a2727be2bcabd6e8d4d48cd64c">
   <xsd:schema xmlns:xsd="http://www.w3.org/2001/XMLSchema" xmlns:xs="http://www.w3.org/2001/XMLSchema" xmlns:p="http://schemas.microsoft.com/office/2006/metadata/properties" xmlns:ns2="606370cc-c8d9-4222-8a4e-3c320f1e3034" xmlns:ns3="bf6b85bd-8a7e-4854-be4d-0780382295a8" targetNamespace="http://schemas.microsoft.com/office/2006/metadata/properties" ma:root="true" ma:fieldsID="153e2816b688b383ad24b8974a641912" ns2:_="" ns3:_="">
     <xsd:import namespace="606370cc-c8d9-4222-8a4e-3c320f1e3034"/>
@@ -6440,6 +6389,21 @@
 </ct:contentTypeSchema>
 </file>
 
+<file path=customXml/item3.xml><?xml version="1.0" encoding="utf-8"?>
+<?mso-contentType ?>
+<FormTemplates xmlns="http://schemas.microsoft.com/sharepoint/v3/contenttype/forms">
+  <Display>DocumentLibraryForm</Display>
+  <Edit>DocumentLibraryForm</Edit>
+  <New>DocumentLibraryForm</New>
+</FormTemplates>
+</file>
+
+<file path=customXml/item4.xml><?xml version="1.0" encoding="utf-8"?>
+<p:properties xmlns:p="http://schemas.microsoft.com/office/2006/metadata/properties" xmlns:xsi="http://www.w3.org/2001/XMLSchema-instance" xmlns:pc="http://schemas.microsoft.com/office/infopath/2007/PartnerControls">
+  <documentManagement/>
+</p:properties>
+</file>
+
 <file path=customXml/itemProps1.xml><?xml version="1.0" encoding="utf-8"?>
 <ds:datastoreItem xmlns:ds="http://schemas.openxmlformats.org/officeDocument/2006/customXml" ds:itemID="{ECA105BE-6F03-4B11-B5C5-150846E15BB5}">
   <ds:schemaRefs>
@@ -6449,31 +6413,6 @@
 </file>
 
 <file path=customXml/itemProps2.xml><?xml version="1.0" encoding="utf-8"?>
-<ds:datastoreItem xmlns:ds="http://schemas.openxmlformats.org/officeDocument/2006/customXml" ds:itemID="{B0D4FDE7-3BA6-4516-A105-B680184AC85B}">
-  <ds:schemaRefs>
-    <ds:schemaRef ds:uri="606370cc-c8d9-4222-8a4e-3c320f1e3034"/>
-    <ds:schemaRef ds:uri="http://www.w3.org/XML/1998/namespace"/>
-    <ds:schemaRef ds:uri="http://schemas.microsoft.com/office/2006/documentManagement/types"/>
-    <ds:schemaRef ds:uri="http://purl.org/dc/terms/"/>
-    <ds:schemaRef ds:uri="http://purl.org/dc/elements/1.1/"/>
-    <ds:schemaRef ds:uri="http://purl.org/dc/dcmitype/"/>
-    <ds:schemaRef ds:uri="http://schemas.microsoft.com/office/infopath/2007/PartnerControls"/>
-    <ds:schemaRef ds:uri="http://schemas.openxmlformats.org/package/2006/metadata/core-properties"/>
-    <ds:schemaRef ds:uri="bf6b85bd-8a7e-4854-be4d-0780382295a8"/>
-    <ds:schemaRef ds:uri="http://schemas.microsoft.com/office/2006/metadata/properties"/>
-  </ds:schemaRefs>
-</ds:datastoreItem>
-</file>
-
-<file path=customXml/itemProps3.xml><?xml version="1.0" encoding="utf-8"?>
-<ds:datastoreItem xmlns:ds="http://schemas.openxmlformats.org/officeDocument/2006/customXml" ds:itemID="{D43A2629-88B9-483E-9D98-8FE0E77A3D20}">
-  <ds:schemaRefs>
-    <ds:schemaRef ds:uri="http://schemas.microsoft.com/sharepoint/v3/contenttype/forms"/>
-  </ds:schemaRefs>
-</ds:datastoreItem>
-</file>
-
-<file path=customXml/itemProps4.xml><?xml version="1.0" encoding="utf-8"?>
 <ds:datastoreItem xmlns:ds="http://schemas.openxmlformats.org/officeDocument/2006/customXml" ds:itemID="{8214CBE9-A225-47AD-B1D8-DB64A4FE2B2E}">
   <ds:schemaRefs>
     <ds:schemaRef ds:uri="http://schemas.microsoft.com/office/2006/metadata/contentType"/>
@@ -6490,4 +6429,21 @@
     <ds:schemaRef ds:uri="http://schemas.microsoft.com/internal/obd"/>
   </ds:schemaRefs>
 </ds:datastoreItem>
+</file>
+
+<file path=customXml/itemProps3.xml><?xml version="1.0" encoding="utf-8"?>
+<ds:datastoreItem xmlns:ds="http://schemas.openxmlformats.org/officeDocument/2006/customXml" ds:itemID="{D43A2629-88B9-483E-9D98-8FE0E77A3D20}">
+  <ds:schemaRefs>
+    <ds:schemaRef ds:uri="http://schemas.microsoft.com/sharepoint/v3/contenttype/forms"/>
+  </ds:schemaRefs>
+</ds:datastoreItem>
+</file>
+
+<file path=customXml/itemProps4.xml><?xml version="1.0" encoding="utf-8"?>
+<ds:datastoreItem xmlns:ds="http://schemas.openxmlformats.org/officeDocument/2006/customXml" ds:itemID="{B0D4FDE7-3BA6-4516-A105-B680184AC85B}">
+  <ds:schemaRefs>
+    <ds:schemaRef ds:uri="http://schemas.microsoft.com/office/2006/metadata/properties"/>
+    <ds:schemaRef ds:uri="http://schemas.microsoft.com/office/infopath/2007/PartnerControls"/>
+  </ds:schemaRefs>
+</ds:datastoreItem>
 </file>
</xml_diff>